<commit_message>
Article draft + gitignore
</commit_message>
<xml_diff>
--- a/Analýza súčasného stavu článok/Analýza_Draft_Luzak.docx
+++ b/Analýza súčasného stavu článok/Analýza_Draft_Luzak.docx
@@ -8,28 +8,18 @@
         <w:rPr>
           <w:b/>
           <w:bCs/>
-          <w:sz w:val="24"/>
-          <w:szCs w:val="24"/>
+          <w:sz w:val="28"/>
+          <w:szCs w:val="28"/>
         </w:rPr>
       </w:pPr>
       <w:r>
         <w:rPr>
           <w:b/>
           <w:bCs/>
-          <w:sz w:val="24"/>
-          <w:szCs w:val="24"/>
-          <w:lang w:val="en-US"/>
-        </w:rPr>
-        <w:t>Identifik</w:t>
-      </w:r>
-      <w:r>
-        <w:rPr>
-          <w:b/>
-          <w:bCs/>
-          <w:sz w:val="24"/>
-          <w:szCs w:val="24"/>
-        </w:rPr>
-        <w:t xml:space="preserve">ácia výskumnej oblasti </w:t>
+          <w:sz w:val="28"/>
+          <w:szCs w:val="28"/>
+        </w:rPr>
+        <w:t xml:space="preserve">Identifikácia výskumnej oblasti </w:t>
       </w:r>
     </w:p>
     <w:p>
@@ -40,48 +30,108 @@
         <w:tab/>
       </w:r>
       <w:r>
+        <w:rPr>
+          <w:sz w:val="24"/>
+          <w:szCs w:val="24"/>
+        </w:rPr>
         <w:t>Správanie</w:t>
       </w:r>
       <w:r>
+        <w:rPr>
+          <w:sz w:val="24"/>
+          <w:szCs w:val="24"/>
+        </w:rPr>
         <w:t xml:space="preserve"> akciových trhov je ovplyvnené veľkým množstvom faktorov,</w:t>
       </w:r>
       <w:r>
+        <w:rPr>
+          <w:sz w:val="24"/>
+          <w:szCs w:val="24"/>
+        </w:rPr>
         <w:t xml:space="preserve"> preto je</w:t>
       </w:r>
       <w:r>
+        <w:rPr>
+          <w:sz w:val="24"/>
+          <w:szCs w:val="24"/>
+        </w:rPr>
         <w:t xml:space="preserve"> predikcia budúceho správania </w:t>
       </w:r>
       <w:r>
+        <w:rPr>
+          <w:sz w:val="24"/>
+          <w:szCs w:val="24"/>
+        </w:rPr>
         <w:t xml:space="preserve">takmer nemožná. Geopolitické šoky ako pandémia COVID-19 majú okamžitý a nepredvídateľný vplyv </w:t>
       </w:r>
       <w:r>
+        <w:rPr>
+          <w:sz w:val="24"/>
+          <w:szCs w:val="24"/>
+        </w:rPr>
         <w:t xml:space="preserve">na </w:t>
       </w:r>
       <w:r>
+        <w:rPr>
+          <w:sz w:val="24"/>
+          <w:szCs w:val="24"/>
+        </w:rPr>
         <w:t xml:space="preserve">dynamiku akciových trhov, pretože pôsobia cez kapitálové toky a šoky likvidity. Identifikácia správania a reakcií </w:t>
       </w:r>
       <w:r>
+        <w:rPr>
+          <w:sz w:val="24"/>
+          <w:szCs w:val="24"/>
+        </w:rPr>
         <w:t xml:space="preserve">akciových </w:t>
       </w:r>
       <w:r>
+        <w:rPr>
+          <w:sz w:val="24"/>
+          <w:szCs w:val="24"/>
+        </w:rPr>
         <w:t>trhov na krízové obdobia</w:t>
       </w:r>
       <w:r>
+        <w:rPr>
+          <w:sz w:val="24"/>
+          <w:szCs w:val="24"/>
+        </w:rPr>
         <w:t xml:space="preserve"> predstavuje</w:t>
       </w:r>
       <w:r>
+        <w:rPr>
+          <w:sz w:val="24"/>
+          <w:szCs w:val="24"/>
+        </w:rPr>
         <w:t xml:space="preserve"> dôležit</w:t>
       </w:r>
       <w:r>
+        <w:rPr>
+          <w:sz w:val="24"/>
+          <w:szCs w:val="24"/>
+        </w:rPr>
         <w:t>ú</w:t>
       </w:r>
       <w:r>
+        <w:rPr>
+          <w:sz w:val="24"/>
+          <w:szCs w:val="24"/>
+        </w:rPr>
         <w:t xml:space="preserve"> </w:t>
       </w:r>
       <w:r>
+        <w:rPr>
+          <w:sz w:val="24"/>
+          <w:szCs w:val="24"/>
+        </w:rPr>
         <w:t xml:space="preserve">a relevantnú </w:t>
       </w:r>
       <w:r>
+        <w:rPr>
+          <w:sz w:val="24"/>
+          <w:szCs w:val="24"/>
+        </w:rPr>
         <w:t xml:space="preserve">oblasť výskumu. </w:t>
       </w:r>
     </w:p>
@@ -91,14 +141,16 @@
         <w:rPr>
           <w:b/>
           <w:bCs/>
+          <w:sz w:val="24"/>
+          <w:szCs w:val="24"/>
         </w:rPr>
       </w:pPr>
       <w:r>
         <w:rPr>
           <w:b/>
           <w:bCs/>
-          <w:sz w:val="24"/>
-          <w:szCs w:val="24"/>
+          <w:sz w:val="28"/>
+          <w:szCs w:val="28"/>
         </w:rPr>
         <w:t>Formulácia výskumného cieľa</w:t>
       </w:r>
@@ -111,69 +163,178 @@
         <w:tab/>
       </w:r>
       <w:r>
+        <w:rPr>
+          <w:sz w:val="24"/>
+          <w:szCs w:val="24"/>
+        </w:rPr>
         <w:t>Analýza súčasnéh</w:t>
       </w:r>
       <w:r>
+        <w:rPr>
+          <w:sz w:val="24"/>
+          <w:szCs w:val="24"/>
+        </w:rPr>
         <w:t>o stavu</w:t>
       </w:r>
       <w:r>
-        <w:t xml:space="preserve"> bude zameraná na vplyv pandémie COVID-19 na</w:t>
-      </w:r>
-      <w:r>
+        <w:rPr>
+          <w:sz w:val="24"/>
+          <w:szCs w:val="24"/>
+        </w:rPr>
+        <w:t xml:space="preserve"> </w:t>
+      </w:r>
+      <w:r>
+        <w:rPr>
+          <w:sz w:val="24"/>
+          <w:szCs w:val="24"/>
+        </w:rPr>
+        <w:t>je</w:t>
+      </w:r>
+      <w:r>
+        <w:rPr>
+          <w:sz w:val="24"/>
+          <w:szCs w:val="24"/>
+        </w:rPr>
+        <w:t xml:space="preserve"> zameraná na vplyv pandémie COVID-19 na</w:t>
+      </w:r>
+      <w:r>
+        <w:rPr>
+          <w:sz w:val="24"/>
+          <w:szCs w:val="24"/>
+        </w:rPr>
         <w:t xml:space="preserve"> volatilitu</w:t>
       </w:r>
       <w:r>
+        <w:rPr>
+          <w:sz w:val="24"/>
+          <w:szCs w:val="24"/>
+        </w:rPr>
         <w:t xml:space="preserve"> akciov</w:t>
       </w:r>
       <w:r>
+        <w:rPr>
+          <w:sz w:val="24"/>
+          <w:szCs w:val="24"/>
+        </w:rPr>
         <w:t>ých</w:t>
       </w:r>
       <w:r>
+        <w:rPr>
+          <w:sz w:val="24"/>
+          <w:szCs w:val="24"/>
+        </w:rPr>
         <w:t xml:space="preserve"> trh</w:t>
       </w:r>
       <w:r>
+        <w:rPr>
+          <w:sz w:val="24"/>
+          <w:szCs w:val="24"/>
+        </w:rPr>
         <w:t>ov</w:t>
       </w:r>
       <w:r>
+        <w:rPr>
+          <w:sz w:val="24"/>
+          <w:szCs w:val="24"/>
+        </w:rPr>
         <w:t xml:space="preserve"> s cieľom identifikovať reakcie na obdobia so zvýšeným rizikom. Budú zhromaždené a analyzované doterajšie výskumné články v</w:t>
       </w:r>
       <w:r>
+        <w:rPr>
+          <w:sz w:val="24"/>
+          <w:szCs w:val="24"/>
+        </w:rPr>
         <w:t> </w:t>
       </w:r>
       <w:r>
+        <w:rPr>
+          <w:sz w:val="24"/>
+          <w:szCs w:val="24"/>
+        </w:rPr>
         <w:t>oblasti</w:t>
       </w:r>
       <w:r>
+        <w:rPr>
+          <w:sz w:val="24"/>
+          <w:szCs w:val="24"/>
+        </w:rPr>
         <w:t xml:space="preserve"> volatilita akciových trhov</w:t>
       </w:r>
       <w:r>
+        <w:rPr>
+          <w:sz w:val="24"/>
+          <w:szCs w:val="24"/>
+        </w:rPr>
         <w:t xml:space="preserve"> a</w:t>
       </w:r>
       <w:r>
+        <w:rPr>
+          <w:sz w:val="24"/>
+          <w:szCs w:val="24"/>
+        </w:rPr>
         <w:t xml:space="preserve"> COVID-19</w:t>
       </w:r>
       <w:r>
+        <w:rPr>
+          <w:sz w:val="24"/>
+          <w:szCs w:val="24"/>
+        </w:rPr>
         <w:t>, ako aj použité metódy modelovania volatility</w:t>
       </w:r>
       <w:r>
-        <w:t>.</w:t>
-      </w:r>
-      <w:r>
-        <w:t xml:space="preserve"> Cieľom je vytvoriť komplexný prehľad dostupnej literatúry, ktorá sa zaoberá porovnaním období pred, počas a po pandémií COVID-19. Výsledkom bude </w:t>
-      </w:r>
-      <w:r>
+        <w:rPr>
+          <w:sz w:val="24"/>
+          <w:szCs w:val="24"/>
+        </w:rPr>
+        <w:t xml:space="preserve">. Cieľom je vytvoriť komplexný prehľad dostupnej literatúry, ktorá sa zaoberá porovnaním období pred, počas a po pandémií COVID-19. Výsledkom </w:t>
+      </w:r>
+      <w:r>
+        <w:rPr>
+          <w:sz w:val="24"/>
+          <w:szCs w:val="24"/>
+        </w:rPr>
+        <w:t>je</w:t>
+      </w:r>
+      <w:r>
+        <w:rPr>
+          <w:sz w:val="24"/>
+          <w:szCs w:val="24"/>
+        </w:rPr>
+        <w:t xml:space="preserve"> </w:t>
+      </w:r>
+      <w:r>
+        <w:rPr>
+          <w:sz w:val="24"/>
+          <w:szCs w:val="24"/>
+        </w:rPr>
         <w:t>zhrnutie</w:t>
       </w:r>
       <w:r>
+        <w:rPr>
+          <w:sz w:val="24"/>
+          <w:szCs w:val="24"/>
+        </w:rPr>
         <w:t xml:space="preserve"> doterajších zistení a porovnanie použitých modelov a</w:t>
       </w:r>
       <w:r>
+        <w:rPr>
+          <w:sz w:val="24"/>
+          <w:szCs w:val="24"/>
+        </w:rPr>
         <w:t> </w:t>
       </w:r>
       <w:r>
+        <w:rPr>
+          <w:sz w:val="24"/>
+          <w:szCs w:val="24"/>
+        </w:rPr>
         <w:t>metód</w:t>
       </w:r>
       <w:r>
+        <w:rPr>
+          <w:sz w:val="24"/>
+          <w:szCs w:val="24"/>
+        </w:rPr>
         <w:t xml:space="preserve">. </w:t>
       </w:r>
     </w:p>
@@ -183,16 +344,16 @@
         <w:rPr>
           <w:b/>
           <w:bCs/>
-          <w:sz w:val="24"/>
-          <w:szCs w:val="24"/>
+          <w:sz w:val="28"/>
+          <w:szCs w:val="28"/>
         </w:rPr>
       </w:pPr>
       <w:r>
         <w:rPr>
           <w:b/>
           <w:bCs/>
-          <w:sz w:val="24"/>
-          <w:szCs w:val="24"/>
+          <w:sz w:val="28"/>
+          <w:szCs w:val="28"/>
         </w:rPr>
         <w:t>Definovanie rozsahu výskumu</w:t>
       </w:r>
@@ -201,7 +362,8 @@
       <w:pPr>
         <w:spacing w:line="276" w:lineRule="auto"/>
         <w:rPr>
-          <w:lang w:val="en-US"/>
+          <w:sz w:val="24"/>
+          <w:szCs w:val="24"/>
         </w:rPr>
       </w:pPr>
       <w:r>
@@ -214,126 +376,478 @@
         <w:tab/>
       </w:r>
       <w:r>
+        <w:rPr>
+          <w:sz w:val="24"/>
+          <w:szCs w:val="24"/>
+        </w:rPr>
         <w:t>Systematický prehľad</w:t>
       </w:r>
       <w:r>
-        <w:t xml:space="preserve"> bude pozostávať zo zhromaždenia</w:t>
-      </w:r>
-      <w:r>
+        <w:rPr>
+          <w:sz w:val="24"/>
+          <w:szCs w:val="24"/>
+        </w:rPr>
+        <w:t xml:space="preserve"> pozostáva zo zhromaždenia</w:t>
+      </w:r>
+      <w:r>
+        <w:rPr>
+          <w:sz w:val="24"/>
+          <w:szCs w:val="24"/>
+        </w:rPr>
         <w:t xml:space="preserve"> a analýzy</w:t>
       </w:r>
       <w:r>
+        <w:rPr>
+          <w:sz w:val="24"/>
+          <w:szCs w:val="24"/>
+        </w:rPr>
         <w:t xml:space="preserve"> dostupnej literatúry v danej oblasti, s dôrazom na databázu </w:t>
       </w:r>
       <w:r>
         <w:rPr>
           <w:i/>
           <w:iCs/>
-        </w:rPr>
-        <w:t>Web of Science Core Collection</w:t>
-      </w:r>
-      <w:r>
-        <w:t xml:space="preserve">. </w:t>
-      </w:r>
-      <w:r>
-        <w:t>Výber bude sústredený primárne na články v anglickom jazyku za posledn</w:t>
-      </w:r>
-      <w:r>
-        <w:t>ých</w:t>
-      </w:r>
-      <w:r>
-        <w:t xml:space="preserve"> </w:t>
-      </w:r>
-      <w:r>
-        <w:t>6</w:t>
-      </w:r>
-      <w:r>
-        <w:t xml:space="preserve"> rok</w:t>
-      </w:r>
-      <w:r>
-        <w:t>ov</w:t>
-      </w:r>
-      <w:r>
-        <w:t xml:space="preserve"> s kritériami volatilita, </w:t>
-      </w:r>
+          <w:sz w:val="24"/>
+          <w:szCs w:val="24"/>
+        </w:rPr>
+        <w:t xml:space="preserve">Web of </w:t>
+      </w:r>
+      <w:proofErr w:type="spellStart"/>
       <w:r>
         <w:rPr>
           <w:i/>
           <w:iCs/>
-        </w:rPr>
-        <w:t>COVID-19</w:t>
-      </w:r>
-      <w:r>
-        <w:t>, akciové trhy</w:t>
-      </w:r>
-      <w:r>
-        <w:t>, ekonometrické modely a metódy umelej inteligencie.</w:t>
-      </w:r>
-      <w:r>
-        <w:t xml:space="preserve"> </w:t>
-      </w:r>
-      <w:r>
-        <w:t>Postup</w:t>
-      </w:r>
-      <w:r>
-        <w:t xml:space="preserve"> </w:t>
-      </w:r>
-      <w:r>
-        <w:t>analýzy</w:t>
-      </w:r>
-      <w:r>
-        <w:t>, ako aj samotného výberu relevantnej literatúry</w:t>
-      </w:r>
-      <w:r>
-        <w:t>,</w:t>
-      </w:r>
-      <w:r>
-        <w:t xml:space="preserve"> je popísaný v diagrame </w:t>
-      </w:r>
-      <w:r>
-        <w:rPr>
-          <w:lang w:val="en-US"/>
-        </w:rPr>
-        <w:t>(</w:t>
-      </w:r>
+          <w:sz w:val="24"/>
+          <w:szCs w:val="24"/>
+        </w:rPr>
+        <w:t>Science</w:t>
+      </w:r>
+      <w:proofErr w:type="spellEnd"/>
       <w:r>
         <w:rPr>
           <w:i/>
           <w:iCs/>
-          <w:lang w:val="en-US"/>
-        </w:rPr>
-        <w:t>Obr</w:t>
-      </w:r>
+          <w:sz w:val="24"/>
+          <w:szCs w:val="24"/>
+        </w:rPr>
+        <w:t xml:space="preserve"> </w:t>
+      </w:r>
+      <w:proofErr w:type="spellStart"/>
       <w:r>
         <w:rPr>
           <w:i/>
           <w:iCs/>
-        </w:rPr>
-        <w:t>ázok 1</w:t>
-      </w:r>
-      <w:r>
-        <w:rPr>
-          <w:lang w:val="en-US"/>
-        </w:rPr>
-        <w:t>).</w:t>
+          <w:sz w:val="24"/>
+          <w:szCs w:val="24"/>
+        </w:rPr>
+        <w:t>Core</w:t>
+      </w:r>
+      <w:proofErr w:type="spellEnd"/>
+      <w:r>
+        <w:rPr>
+          <w:i/>
+          <w:iCs/>
+          <w:sz w:val="24"/>
+          <w:szCs w:val="24"/>
+        </w:rPr>
+        <w:t xml:space="preserve"> </w:t>
+      </w:r>
+      <w:proofErr w:type="spellStart"/>
+      <w:r>
+        <w:rPr>
+          <w:i/>
+          <w:iCs/>
+          <w:sz w:val="24"/>
+          <w:szCs w:val="24"/>
+        </w:rPr>
+        <w:t>Collection</w:t>
+      </w:r>
+      <w:proofErr w:type="spellEnd"/>
+      <w:r>
+        <w:rPr>
+          <w:sz w:val="24"/>
+          <w:szCs w:val="24"/>
+        </w:rPr>
+        <w:t xml:space="preserve">. </w:t>
+      </w:r>
+      <w:r>
+        <w:rPr>
+          <w:sz w:val="24"/>
+          <w:szCs w:val="24"/>
+        </w:rPr>
+        <w:t xml:space="preserve">Výber </w:t>
+      </w:r>
+      <w:r>
+        <w:rPr>
+          <w:sz w:val="24"/>
+          <w:szCs w:val="24"/>
+        </w:rPr>
+        <w:t>je</w:t>
+      </w:r>
+      <w:r>
+        <w:rPr>
+          <w:sz w:val="24"/>
+          <w:szCs w:val="24"/>
+        </w:rPr>
+        <w:t xml:space="preserve"> sústredený primárne na články v anglickom jazyku za posledn</w:t>
+      </w:r>
+      <w:r>
+        <w:rPr>
+          <w:sz w:val="24"/>
+          <w:szCs w:val="24"/>
+        </w:rPr>
+        <w:t>ých</w:t>
+      </w:r>
+      <w:r>
+        <w:rPr>
+          <w:sz w:val="24"/>
+          <w:szCs w:val="24"/>
+        </w:rPr>
+        <w:t xml:space="preserve"> </w:t>
+      </w:r>
+      <w:r>
+        <w:rPr>
+          <w:sz w:val="24"/>
+          <w:szCs w:val="24"/>
+        </w:rPr>
+        <w:t>6</w:t>
+      </w:r>
+      <w:r>
+        <w:rPr>
+          <w:sz w:val="24"/>
+          <w:szCs w:val="24"/>
+        </w:rPr>
+        <w:t xml:space="preserve"> rok</w:t>
+      </w:r>
+      <w:r>
+        <w:rPr>
+          <w:sz w:val="24"/>
+          <w:szCs w:val="24"/>
+        </w:rPr>
+        <w:t>ov</w:t>
+      </w:r>
+      <w:r>
+        <w:rPr>
+          <w:sz w:val="24"/>
+          <w:szCs w:val="24"/>
+        </w:rPr>
+        <w:t xml:space="preserve"> s kritériami volatilita, </w:t>
+      </w:r>
+      <w:r>
+        <w:rPr>
+          <w:i/>
+          <w:iCs/>
+          <w:sz w:val="24"/>
+          <w:szCs w:val="24"/>
+        </w:rPr>
+        <w:t>COVID-19</w:t>
+      </w:r>
+      <w:r>
+        <w:rPr>
+          <w:sz w:val="24"/>
+          <w:szCs w:val="24"/>
+        </w:rPr>
+        <w:t>, akciové trhy</w:t>
+      </w:r>
+      <w:r>
+        <w:rPr>
+          <w:sz w:val="24"/>
+          <w:szCs w:val="24"/>
+        </w:rPr>
+        <w:t>, ekonometrické modely a metódy umelej inteligencie.</w:t>
       </w:r>
     </w:p>
     <w:p>
       <w:pPr>
-        <w:rPr>
-          <w:lang w:val="en-US"/>
+        <w:spacing w:line="276" w:lineRule="auto"/>
+        <w:rPr>
+          <w:sz w:val="24"/>
+          <w:szCs w:val="24"/>
         </w:rPr>
       </w:pPr>
       <w:r>
         <w:rPr>
+          <w:b/>
+          <w:bCs/>
+          <w:sz w:val="28"/>
+          <w:szCs w:val="28"/>
+        </w:rPr>
+        <w:t>Literatúra</w:t>
+      </w:r>
+    </w:p>
+    <w:p>
+      <w:pPr>
+        <w:keepNext/>
+        <w:spacing w:line="276" w:lineRule="auto"/>
+        <w:rPr>
+          <w:sz w:val="24"/>
+          <w:szCs w:val="24"/>
+        </w:rPr>
+      </w:pPr>
+      <w:r>
+        <w:rPr>
+          <w:sz w:val="24"/>
+          <w:szCs w:val="24"/>
+        </w:rPr>
+        <w:tab/>
+        <w:t>Analýza dostupnej literatúry spočívala z identifikácia najrelevantnejších štúdií v oblasti volatilita, akciové trhy, COVID-19</w:t>
+      </w:r>
+      <w:r>
+        <w:rPr>
+          <w:sz w:val="24"/>
+          <w:szCs w:val="24"/>
+        </w:rPr>
+        <w:t>, ekonometrické modely</w:t>
+      </w:r>
+      <w:r>
+        <w:rPr>
+          <w:sz w:val="24"/>
+          <w:szCs w:val="24"/>
+        </w:rPr>
+        <w:t xml:space="preserve"> a metódy umelej inteligencie. Na tento účel sme zhromaždili dostupnú literatúru z databázy </w:t>
+      </w:r>
+      <w:r>
+        <w:rPr>
+          <w:i/>
+          <w:iCs/>
+          <w:sz w:val="24"/>
+          <w:szCs w:val="24"/>
+        </w:rPr>
+        <w:t xml:space="preserve">Web of </w:t>
+      </w:r>
+      <w:proofErr w:type="spellStart"/>
+      <w:r>
+        <w:rPr>
+          <w:i/>
+          <w:iCs/>
+          <w:sz w:val="24"/>
+          <w:szCs w:val="24"/>
+        </w:rPr>
+        <w:t>Science</w:t>
+      </w:r>
+      <w:proofErr w:type="spellEnd"/>
+      <w:r>
+        <w:rPr>
+          <w:sz w:val="24"/>
+          <w:szCs w:val="24"/>
+        </w:rPr>
+        <w:t xml:space="preserve"> (</w:t>
+      </w:r>
+      <w:proofErr w:type="spellStart"/>
+      <w:r>
+        <w:rPr>
+          <w:sz w:val="24"/>
+          <w:szCs w:val="24"/>
+        </w:rPr>
+        <w:t>WoS</w:t>
+      </w:r>
+      <w:proofErr w:type="spellEnd"/>
+      <w:r>
+        <w:rPr>
+          <w:sz w:val="24"/>
+          <w:szCs w:val="24"/>
+        </w:rPr>
+        <w:t xml:space="preserve">), s dôrazom na indexy SSCI, ESCI a SCIE. Na vyhľadávanie relevantnej literatúry sme sformulovali 4 kombinácie spomínaných kľúčových slov, ktoré identifikovali takmer 2500 článkov v anglickom jazyku za posledných 6 rokov. Na základe názvu, abstraktu a kľúčových slov autora sme vytvorili sieť </w:t>
+      </w:r>
+      <w:r>
+        <w:rPr>
+          <w:sz w:val="24"/>
+          <w:szCs w:val="24"/>
+        </w:rPr>
+        <w:t>spolu výskytov</w:t>
+      </w:r>
+      <w:r>
+        <w:rPr>
+          <w:sz w:val="24"/>
+          <w:szCs w:val="24"/>
+        </w:rPr>
+        <w:t xml:space="preserve"> prostredníctvom </w:t>
+      </w:r>
+      <w:proofErr w:type="spellStart"/>
+      <w:r>
+        <w:rPr>
+          <w:i/>
+          <w:iCs/>
+          <w:sz w:val="24"/>
+          <w:szCs w:val="24"/>
+        </w:rPr>
+        <w:t>VOSviewer</w:t>
+      </w:r>
+      <w:proofErr w:type="spellEnd"/>
+      <w:r>
+        <w:rPr>
+          <w:sz w:val="24"/>
+          <w:szCs w:val="24"/>
+        </w:rPr>
+        <w:t>, ktorý identifikoval značnú prevahu článkov zaoberajúcich sa komoditami ako zlato, ropa a kryptomeny. Tieto štúdie boli následne odstránené</w:t>
+      </w:r>
+      <w:r>
+        <w:rPr>
+          <w:sz w:val="24"/>
+          <w:szCs w:val="24"/>
+        </w:rPr>
+        <w:t xml:space="preserve"> z dôvodu nízkej relevantnosti</w:t>
+      </w:r>
+      <w:r>
+        <w:rPr>
+          <w:sz w:val="24"/>
+          <w:szCs w:val="24"/>
+        </w:rPr>
+        <w:t xml:space="preserve">, čo </w:t>
+      </w:r>
+      <w:r>
+        <w:rPr>
+          <w:sz w:val="24"/>
+          <w:szCs w:val="24"/>
+        </w:rPr>
+        <w:t xml:space="preserve">výrazne </w:t>
+      </w:r>
+      <w:r>
+        <w:rPr>
+          <w:sz w:val="24"/>
+          <w:szCs w:val="24"/>
+        </w:rPr>
+        <w:t>zredukovalo</w:t>
+      </w:r>
+      <w:r>
+        <w:rPr>
+          <w:sz w:val="24"/>
+          <w:szCs w:val="24"/>
+        </w:rPr>
+        <w:t xml:space="preserve"> </w:t>
+      </w:r>
+      <w:r>
+        <w:rPr>
+          <w:sz w:val="24"/>
+          <w:szCs w:val="24"/>
+        </w:rPr>
+        <w:t xml:space="preserve">literatúru na 379 článkov.  </w:t>
+      </w:r>
+      <w:r>
+        <w:rPr>
+          <w:sz w:val="24"/>
+          <w:szCs w:val="24"/>
+        </w:rPr>
+        <w:t xml:space="preserve">Po opakovanom použití </w:t>
+      </w:r>
+      <w:proofErr w:type="spellStart"/>
+      <w:r>
+        <w:rPr>
+          <w:i/>
+          <w:iCs/>
+          <w:sz w:val="24"/>
+          <w:szCs w:val="24"/>
+        </w:rPr>
+        <w:t>VOSviewer</w:t>
+      </w:r>
+      <w:proofErr w:type="spellEnd"/>
+      <w:r>
+        <w:rPr>
+          <w:sz w:val="24"/>
+          <w:szCs w:val="24"/>
+        </w:rPr>
+        <w:t xml:space="preserve"> na zvyšné články je zrejmé, že sme dostatočne zachytili výskumnú problematiku (</w:t>
+      </w:r>
+      <w:r>
+        <w:rPr>
+          <w:i/>
+          <w:iCs/>
+          <w:sz w:val="24"/>
+          <w:szCs w:val="24"/>
+        </w:rPr>
+        <w:t xml:space="preserve">Obrázok </w:t>
+      </w:r>
+      <w:r>
+        <w:rPr>
+          <w:i/>
+          <w:iCs/>
+          <w:sz w:val="24"/>
+          <w:szCs w:val="24"/>
+        </w:rPr>
+        <w:t>1</w:t>
+      </w:r>
+      <w:r>
+        <w:rPr>
+          <w:sz w:val="24"/>
+          <w:szCs w:val="24"/>
+        </w:rPr>
+        <w:t>).</w:t>
+      </w:r>
+    </w:p>
+    <w:p>
+      <w:pPr>
+        <w:keepNext/>
+        <w:spacing w:line="276" w:lineRule="auto"/>
+        <w:ind w:firstLine="708"/>
+      </w:pPr>
+      <w:r>
+        <w:rPr>
+          <w:sz w:val="24"/>
+          <w:szCs w:val="24"/>
+        </w:rPr>
+        <w:t>Zvyšné</w:t>
+      </w:r>
+      <w:r>
+        <w:rPr>
+          <w:sz w:val="24"/>
+          <w:szCs w:val="24"/>
+        </w:rPr>
+        <w:t xml:space="preserve"> články prešli manuálnou kontrolou podľa preddefinovaných kritérií (</w:t>
+      </w:r>
+      <w:r>
+        <w:rPr>
+          <w:i/>
+          <w:iCs/>
+          <w:sz w:val="24"/>
+          <w:szCs w:val="24"/>
+        </w:rPr>
+        <w:t>Obrázok 2</w:t>
+      </w:r>
+      <w:r>
+        <w:rPr>
+          <w:sz w:val="24"/>
+          <w:szCs w:val="24"/>
+        </w:rPr>
+        <w:t>), ktorá identifikovala 31 najrelevantnejších štúdií. Veľká časť literatúry sa sústredí na Indiu a blízky východ. Tieto články boli odstránené z dôvodu nízkej relevantnosti skúmaných oblastí. Vyradené boli rovnako články, ktoré sa nezaoberajú metódami umelej inteligencie, a teda majú nízku relevantnosť pre</w:t>
+      </w:r>
+      <w:r>
+        <w:rPr>
+          <w:sz w:val="24"/>
+          <w:szCs w:val="24"/>
+        </w:rPr>
+        <w:t xml:space="preserve"> </w:t>
+      </w:r>
+      <w:r>
+        <w:rPr>
+          <w:sz w:val="24"/>
+          <w:szCs w:val="24"/>
+        </w:rPr>
+        <w:t>tento</w:t>
+      </w:r>
+      <w:r>
+        <w:rPr>
+          <w:sz w:val="24"/>
+          <w:szCs w:val="24"/>
+        </w:rPr>
+        <w:t xml:space="preserve"> výskum. Z dostupnej literatúry je zrejmé, že výskum sa zameriava hlavne analýzou a modelovaním špecifických akciových indexov s nízkou </w:t>
+      </w:r>
+      <w:r>
+        <w:rPr>
+          <w:sz w:val="24"/>
+          <w:szCs w:val="24"/>
+        </w:rPr>
+        <w:lastRenderedPageBreak/>
+        <w:t xml:space="preserve">generalizáciou pre USA, Čínu a Európu.  </w:t>
+      </w:r>
+      <w:r>
+        <w:rPr>
           <w:noProof/>
-          <w:lang w:val="en-US"/>
         </w:rPr>
         <w:drawing>
-          <wp:inline distT="0" distB="0" distL="0" distR="0" wp14:anchorId="5342D9D9" wp14:editId="0BC1BA6A">
-            <wp:extent cx="5762625" cy="3209925"/>
-            <wp:effectExtent l="0" t="0" r="9525" b="9525"/>
-            <wp:docPr id="187999925" name="Obrázok 1"/>
+          <wp:inline distT="0" distB="0" distL="0" distR="0" wp14:anchorId="736C98C1" wp14:editId="5B8C97AD">
+            <wp:extent cx="5844209" cy="3710004"/>
+            <wp:effectExtent l="0" t="0" r="4445" b="5080"/>
+            <wp:docPr id="1734013951" name="Obrázok 1"/>
             <wp:cNvGraphicFramePr>
               <a:graphicFrameLocks xmlns:a="http://schemas.openxmlformats.org/drawingml/2006/main" noChangeAspect="1"/>
             </wp:cNvGraphicFramePr>
@@ -362,7 +876,7 @@
                   <pic:spPr bwMode="auto">
                     <a:xfrm>
                       <a:off x="0" y="0"/>
-                      <a:ext cx="5762625" cy="3209925"/>
+                      <a:ext cx="5845573" cy="3710870"/>
                     </a:xfrm>
                     <a:prstGeom prst="rect">
                       <a:avLst/>
@@ -382,34 +896,161 @@
     <w:p>
       <w:pPr>
         <w:pStyle w:val="Popis"/>
-        <w:rPr>
-          <w:sz w:val="22"/>
-          <w:szCs w:val="22"/>
-          <w:lang w:val="en-US"/>
+        <w:spacing w:line="276" w:lineRule="auto"/>
+        <w:rPr>
+          <w:sz w:val="20"/>
+          <w:szCs w:val="20"/>
         </w:rPr>
       </w:pPr>
       <w:r>
+        <w:rPr>
+          <w:sz w:val="20"/>
+          <w:szCs w:val="20"/>
+        </w:rPr>
         <w:t xml:space="preserve">Obrázok </w:t>
       </w:r>
-      <w:fldSimple w:instr=" SEQ Figure \* ARABIC ">
-        <w:r>
-          <w:rPr>
-            <w:noProof/>
-          </w:rPr>
-          <w:t>1</w:t>
-        </w:r>
-      </w:fldSimple>
-      <w:r>
-        <w:t xml:space="preserve"> Postup analýzy súčasného stavu</w:t>
-      </w:r>
-      <w:r>
+      <w:r>
+        <w:rPr>
+          <w:sz w:val="20"/>
+          <w:szCs w:val="20"/>
+        </w:rPr>
+        <w:t>1</w:t>
+      </w:r>
+      <w:r>
+        <w:rPr>
+          <w:sz w:val="20"/>
+          <w:szCs w:val="20"/>
+        </w:rPr>
+        <w:t xml:space="preserve"> Sieť spolu</w:t>
+      </w:r>
+      <w:r>
+        <w:rPr>
+          <w:sz w:val="20"/>
+          <w:szCs w:val="20"/>
+        </w:rPr>
+        <w:t xml:space="preserve"> </w:t>
+      </w:r>
+      <w:r>
+        <w:rPr>
+          <w:sz w:val="20"/>
+          <w:szCs w:val="20"/>
+        </w:rPr>
+        <w:t xml:space="preserve">výskytov </w:t>
+      </w:r>
+      <w:proofErr w:type="spellStart"/>
+      <w:r>
+        <w:rPr>
+          <w:sz w:val="20"/>
+          <w:szCs w:val="20"/>
+        </w:rPr>
+        <w:t>VOSviewer</w:t>
+      </w:r>
+      <w:proofErr w:type="spellEnd"/>
+      <w:r>
+        <w:rPr>
+          <w:sz w:val="20"/>
+          <w:szCs w:val="20"/>
+        </w:rPr>
         <w:t>.</w:t>
       </w:r>
       <w:r>
         <w:rPr>
           <w:rStyle w:val="Odkaznapoznmkupodiarou"/>
+          <w:sz w:val="20"/>
+          <w:szCs w:val="20"/>
         </w:rPr>
         <w:footnoteReference w:id="1"/>
+      </w:r>
+      <w:r>
+        <w:rPr>
+          <w:sz w:val="20"/>
+          <w:szCs w:val="20"/>
+        </w:rPr>
+        <w:t xml:space="preserve"> </w:t>
+      </w:r>
+    </w:p>
+    <w:p>
+      <w:pPr>
+        <w:keepNext/>
+        <w:spacing w:line="276" w:lineRule="auto"/>
+      </w:pPr>
+      <w:r>
+        <w:rPr>
+          <w:noProof/>
+        </w:rPr>
+        <w:drawing>
+          <wp:inline distT="0" distB="0" distL="0" distR="0" wp14:anchorId="3414F014" wp14:editId="157DE387">
+            <wp:extent cx="5760720" cy="3208864"/>
+            <wp:effectExtent l="0" t="0" r="0" b="0"/>
+            <wp:docPr id="688876520" name="Obrázok 1"/>
+            <wp:cNvGraphicFramePr>
+              <a:graphicFrameLocks xmlns:a="http://schemas.openxmlformats.org/drawingml/2006/main" noChangeAspect="1"/>
+            </wp:cNvGraphicFramePr>
+            <a:graphic xmlns:a="http://schemas.openxmlformats.org/drawingml/2006/main">
+              <a:graphicData uri="http://schemas.openxmlformats.org/drawingml/2006/picture">
+                <pic:pic xmlns:pic="http://schemas.openxmlformats.org/drawingml/2006/picture">
+                  <pic:nvPicPr>
+                    <pic:cNvPr id="0" name="Picture 1"/>
+                    <pic:cNvPicPr>
+                      <a:picLocks noChangeAspect="1" noChangeArrowheads="1"/>
+                    </pic:cNvPicPr>
+                  </pic:nvPicPr>
+                  <pic:blipFill>
+                    <a:blip r:embed="rId8" cstate="print">
+                      <a:extLst>
+                        <a:ext uri="{28A0092B-C50C-407E-A947-70E740481C1C}">
+                          <a14:useLocalDpi xmlns:a14="http://schemas.microsoft.com/office/drawing/2010/main" val="0"/>
+                        </a:ext>
+                      </a:extLst>
+                    </a:blip>
+                    <a:srcRect/>
+                    <a:stretch>
+                      <a:fillRect/>
+                    </a:stretch>
+                  </pic:blipFill>
+                  <pic:spPr bwMode="auto">
+                    <a:xfrm>
+                      <a:off x="0" y="0"/>
+                      <a:ext cx="5760720" cy="3208864"/>
+                    </a:xfrm>
+                    <a:prstGeom prst="rect">
+                      <a:avLst/>
+                    </a:prstGeom>
+                    <a:noFill/>
+                    <a:ln>
+                      <a:noFill/>
+                    </a:ln>
+                  </pic:spPr>
+                </pic:pic>
+              </a:graphicData>
+            </a:graphic>
+          </wp:inline>
+        </w:drawing>
+      </w:r>
+    </w:p>
+    <w:p>
+      <w:pPr>
+        <w:pStyle w:val="Popis"/>
+        <w:spacing w:line="276" w:lineRule="auto"/>
+        <w:rPr>
+          <w:sz w:val="20"/>
+          <w:szCs w:val="20"/>
+        </w:rPr>
+      </w:pPr>
+      <w:r>
+        <w:rPr>
+          <w:sz w:val="20"/>
+          <w:szCs w:val="20"/>
+        </w:rPr>
+        <w:t>Obrázok 2 Proces manuálnej kontroly literatúry.</w:t>
+      </w:r>
+      <w:r>
+        <w:rPr>
+          <w:rStyle w:val="Odkaznapoznmkupodiarou"/>
+          <w:sz w:val="20"/>
+          <w:szCs w:val="20"/>
+        </w:rPr>
+        <w:footnoteReference w:id="2"/>
       </w:r>
     </w:p>
     <w:sectPr>
@@ -481,13 +1122,32 @@
         <w:footnoteRef/>
       </w:r>
       <w:r>
-        <w:t xml:space="preserve"> Zdroj</w:t>
-      </w:r>
-      <w:r>
-        <w:t xml:space="preserve"> Obrázok 1</w:t>
+        <w:t xml:space="preserve"> Zdroj Obrázok </w:t>
+      </w:r>
+      <w:r>
+        <w:t>1</w:t>
       </w:r>
       <w:r>
         <w:t>: Autor.</w:t>
+      </w:r>
+    </w:p>
+  </w:footnote>
+  <w:footnote w:id="2">
+    <w:p>
+      <w:pPr>
+        <w:pStyle w:val="Textpoznmkypodiarou"/>
+      </w:pPr>
+      <w:r>
+        <w:rPr>
+          <w:rStyle w:val="Odkaznapoznmkupodiarou"/>
+        </w:rPr>
+        <w:footnoteRef/>
+      </w:r>
+      <w:r>
+        <w:t xml:space="preserve"> </w:t>
+      </w:r>
+      <w:r>
+        <w:t>Zdroj Obrázok 2: Autor.</w:t>
       </w:r>
     </w:p>
   </w:footnote>

</xml_diff>